<commit_message>
UAV registrations 35 -> 50; counts updated across site, README, deck and scripts
- 15 new DTM-synth registrations from the 2025-2026 platform pool (84 tried, 19 passed the <=10 m hold-out gate; 4 passed but were left out after a visual check: fragmented, mostly empty or featureless forest)
- 50 in total across 10 counties, 19 in Kaohsiung; hold-out RMSE median 2.2 m, max 7.6 m
- Garbled village name in one source record dropped from its title
- Landing, /roadmap, uav_cesium banner, README, ARCHITECTURE_v3; deck slide 3 and notes, speaker script, Q&A drill (Q2 reworded: method development stopped, existing pipeline run on existing photos)

Co-Authored-By: Claude Opus 5.5 <noreply@anthropic.com>
</commit_message>
<xml_diff>
--- a/presentation/評審問答演練.docx
+++ b/presentation/評審問答演練.docx
@@ -299,7 +299,7 @@
           <w:i w:val="0"/>
           <w:sz w:val="24"/>
         </w:rPr>
-        <w:t>我們停止的是把 3D 和 UAV 當主線、繼續擴充，主線仍是坡面證據鏈。UAV 那 35 組是先前完成的成果，解決的是水保署歷史 UAV 照片沒有座標、不能疊圖的問題；坡面頁的 3D 只是檢視工具，把官方航照貼在地形上方便判讀，不參與任何計算或排序。</w:t>
+        <w:t>我們停止的是把 3D 和 UAV 當主線、繼續擴充，主線仍是坡面證據鏈。UAV 那 50 組沒有新開發方法，是用同一套流程、同一個門檻，把水保署歷史影像平台上既有的照片批次跑完，解決的是歷史 UAV 照片沒有座標、不能疊圖的問題；坡面頁的 3D 只是檢視工具，把官方航照貼在地形上方便判讀，不參與任何計算或排序。</w:t>
       </w:r>
     </w:p>
     <w:p>
@@ -332,7 +332,7 @@
           <w:i w:val="0"/>
           <w:sz w:val="22"/>
         </w:rPr>
-        <w:t>：每組留出 30% 匹配點檢核，地面誤差 RMSE ≤10 m 才發布；10 月新上傳的 33 張候選只有 5 張通過，失敗的都照實記錄、不降標準。</w:t>
+        <w:t>：每組留出 30% 匹配點檢核，地面誤差 RMSE ≤10 m 才發布；10 月底的批次 84 張實際嘗試只有 19 張通過，其中 4 張畫面不適合展示也不發布；50 組留出點誤差中位數 2.2 m、最大 7.6 m。失敗的都照實記錄、不降標準。</w:t>
       </w:r>
     </w:p>
     <w:p>
@@ -346,7 +346,7 @@
           <w:i w:val="0"/>
           <w:sz w:val="22"/>
         </w:rPr>
-        <w:t>為什麼還加了 5 組</w:t>
+        <w:t>為什麼從 35 組變 50 組</w:t>
       </w:r>
       <w:r>
         <w:rPr>
@@ -354,7 +354,7 @@
           <w:i w:val="0"/>
           <w:sz w:val="22"/>
         </w:rPr>
-        <w:t>：歷史影像平台 10 月 15 日剛上傳高雄六龜寶來（POC 範圍內）的空拍，順手驗證流程對新資料仍可用；之後不再擴充。</w:t>
+        <w:t>：停止的是方法開發與主線地位，不是不能用現成流程補成果。10 月底用既有流程批次處理平台上 2025–2026 年的照片，其中 19 組在高雄 POC 一帶（含 10 月 15 日剛上傳的六龜寶來），順便驗證流程對新資料仍可用。</w:t>
       </w:r>
     </w:p>
     <w:p>
@@ -1342,7 +1342,7 @@
                 <w:i w:val="0"/>
                 <w:sz w:val="20"/>
               </w:rPr>
-              <w:t>35 組（2026-10 新增 5 組，3 組在六龜寶來）</w:t>
+              <w:t>50 組（10 縣市、19 組在高雄；留出點 RMSE 中位數 2.2 m，最大 7.6 m；10 月底批次 84 試 19 過）</w:t>
             </w:r>
           </w:p>
         </w:tc>

</xml_diff>

<commit_message>
Deck slide 6: replicable, extensible, deployable; benefit figure; Q&A for judging criteria
- Slide 6: first card notes that only 3% (Hualien) / 5% (Taroko) of slopes are listed; middle card becomes "可複製、可延展、能落地" (other basins already run, new evidence plugs in as a class, data from existing ARDSWC platforms, output fits current patrol workflow)
- Speaker notes and script: benefit sentence and replicability/extensibility/deployability added, 69% sentence dropped to keep ~50 s
- Q&A drill: new section on value and benefit, cross-domain collaboration and innovation, and live-demo verification status; quick-reference row for listed-slope ratios
- Word files and PDF regenerated

Co-Authored-By: Claude Opus 5.5 <noreply@anthropic.com>
</commit_message>
<xml_diff>
--- a/presentation/評審問答演練.docx
+++ b/presentation/評審問答演練.docx
@@ -643,7 +643,674 @@
           <w:color w:val="2C5F2D"/>
           <w:sz w:val="30"/>
         </w:rPr>
-        <w:t>二、其他可能的提問</w:t>
+        <w:t>二、對照評分重點：價值效益、跨領域與技術創新、實機驗證</w:t>
+      </w:r>
+    </w:p>
+    <w:p>
+      <w:pPr>
+        <w:pStyle w:val="Heading2"/>
+        <w:spacing w:before="200"/>
+      </w:pPr>
+      <w:r>
+        <w:rPr>
+          <w:b/>
+        </w:rPr>
+      </w:r>
+      <w:r>
+        <w:rPr>
+          <w:rFonts w:ascii="Microsoft JhengHei" w:hAnsi="Microsoft JhengHei" w:eastAsia="Microsoft JhengHei" w:cs="Microsoft JhengHei"/>
+          <w:b/>
+          <w:i w:val="0"/>
+          <w:color w:val="2C5F2D"/>
+          <w:sz w:val="26"/>
+        </w:rPr>
+        <w:t>Q4：這個方案的價值與效益在哪裡看得到？</w:t>
+      </w:r>
+    </w:p>
+    <w:p>
+      <w:r>
+        <w:rPr>
+          <w:rFonts w:ascii="Microsoft JhengHei" w:hAnsi="Microsoft JhengHei" w:eastAsia="Microsoft JhengHei" w:cs="Microsoft JhengHei"/>
+          <w:b/>
+          <w:i w:val="0"/>
+          <w:sz w:val="22"/>
+        </w:rPr>
+        <w:t>30 秒回答</w:t>
+      </w:r>
+    </w:p>
+    <w:p>
+      <w:pPr>
+        <w:pBdr>
+          <w:left w:val="single" w:sz="18" w:space="8" w:color="2C5F2D"/>
+        </w:pBdr>
+        <w:ind w:left="227"/>
+      </w:pPr>
+      <w:r>
+        <w:rPr>
+          <w:rFonts w:ascii="Microsoft JhengHei" w:hAnsi="Microsoft JhengHei" w:eastAsia="Microsoft JhengHei" w:cs="Microsoft JhengHei"/>
+          <w:i w:val="0"/>
+          <w:sz w:val="24"/>
+        </w:rPr>
+        <w:t>效益是把巡查範圍縮小、而且知道縮小後漏掉多少。花蓮大事件後，系統只列出 3% 的坡面，就涵蓋四分之三的崩塌坡面；太魯閣列出 5%，涵蓋 43%。高雄平時 12,730 個有效坡面，優先判讀只有 411 個，約 3%，每個都附理由。</w:t>
+      </w:r>
+    </w:p>
+    <w:p>
+      <w:r>
+        <w:rPr>
+          <w:rFonts w:ascii="Microsoft JhengHei" w:hAnsi="Microsoft JhengHei" w:eastAsia="Microsoft JhengHei" w:cs="Microsoft JhengHei"/>
+          <w:b/>
+          <w:i w:val="0"/>
+          <w:sz w:val="22"/>
+        </w:rPr>
+        <w:t>被追問時的第二層</w:t>
+      </w:r>
+    </w:p>
+    <w:p>
+      <w:pPr>
+        <w:pStyle w:val="ListBullet"/>
+      </w:pPr>
+      <w:r>
+        <w:rPr>
+          <w:rFonts w:ascii="Microsoft JhengHei" w:hAnsi="Microsoft JhengHei" w:eastAsia="Microsoft JhengHei" w:cs="Microsoft JhengHei"/>
+          <w:b/>
+          <w:i w:val="0"/>
+          <w:sz w:val="22"/>
+        </w:rPr>
+        <w:t>怎麼算</w:t>
+      </w:r>
+      <w:r>
+        <w:rPr>
+          <w:rFonts w:ascii="Microsoft JhengHei" w:hAnsi="Microsoft JhengHei" w:eastAsia="Microsoft JhengHei" w:cs="Microsoft JhengHei"/>
+          <w:i w:val="0"/>
+          <w:sz w:val="22"/>
+        </w:rPr>
+        <w:t>：花蓮 196／6,547 個坡面被列出（73 個崩塌＋123 個誤報），太魯閣 254／4,749；高雄 411／12,730。</w:t>
+      </w:r>
+    </w:p>
+    <w:p>
+      <w:pPr>
+        <w:pStyle w:val="ListBullet"/>
+      </w:pPr>
+      <w:r>
+        <w:rPr>
+          <w:rFonts w:ascii="Microsoft JhengHei" w:hAnsi="Microsoft JhengHei" w:eastAsia="Microsoft JhengHei" w:cs="Microsoft JhengHei"/>
+          <w:b/>
+          <w:i w:val="0"/>
+          <w:sz w:val="22"/>
+        </w:rPr>
+        <w:t>還有哪些效益</w:t>
+      </w:r>
+      <w:r>
+        <w:rPr>
+          <w:rFonts w:ascii="Microsoft JhengHei" w:hAnsi="Microsoft JhengHei" w:eastAsia="Microsoft JhengHei" w:cs="Microsoft JhengHei"/>
+          <w:i w:val="0"/>
+          <w:sz w:val="22"/>
+        </w:rPr>
+        <w:t>：50 張原本沒有座標的 UAV 歷史照片重新疊回地圖；坡面頁同時列出道路、建物與土石流潛勢溪流，回答「崩了會碰到誰」。</w:t>
+      </w:r>
+    </w:p>
+    <w:p>
+      <w:pPr>
+        <w:pStyle w:val="ListBullet"/>
+      </w:pPr>
+      <w:r>
+        <w:rPr>
+          <w:rFonts w:ascii="Microsoft JhengHei" w:hAnsi="Microsoft JhengHei" w:eastAsia="Microsoft JhengHei" w:cs="Microsoft JhengHei"/>
+          <w:b/>
+          <w:i w:val="0"/>
+          <w:sz w:val="22"/>
+        </w:rPr>
+        <w:t>不能說的</w:t>
+      </w:r>
+      <w:r>
+        <w:rPr>
+          <w:rFonts w:ascii="Microsoft JhengHei" w:hAnsi="Microsoft JhengHei" w:eastAsia="Microsoft JhengHei" w:cs="Microsoft JhengHei"/>
+          <w:i w:val="0"/>
+          <w:sz w:val="22"/>
+        </w:rPr>
+        <w:t>：還沒有實務人員測試結果，不宣稱「巡查時間省了幾 %」。</w:t>
+      </w:r>
+    </w:p>
+    <w:p>
+      <w:pPr>
+        <w:pStyle w:val="ListBullet"/>
+      </w:pPr>
+      <w:r>
+        <w:rPr>
+          <w:rFonts w:ascii="Microsoft JhengHei" w:hAnsi="Microsoft JhengHei" w:eastAsia="Microsoft JhengHei" w:cs="Microsoft JhengHei"/>
+          <w:b/>
+          <w:i w:val="0"/>
+          <w:sz w:val="22"/>
+        </w:rPr>
+        <w:t>可翻</w:t>
+      </w:r>
+      <w:r>
+        <w:rPr>
+          <w:rFonts w:ascii="Microsoft JhengHei" w:hAnsi="Microsoft JhengHei" w:eastAsia="Microsoft JhengHei" w:cs="Microsoft JhengHei"/>
+          <w:i w:val="0"/>
+          <w:sz w:val="22"/>
+        </w:rPr>
+        <w:t xml:space="preserve">：第 5、6 頁；網站 </w:t>
+      </w:r>
+      <w:r>
+        <w:rPr>
+          <w:rFonts w:ascii="Consolas" w:hAnsi="Consolas" w:eastAsia="Microsoft JhengHei" w:cs="Consolas"/>
+          <w:i w:val="0"/>
+          <w:sz w:val="20"/>
+        </w:rPr>
+        <w:t>/su</w:t>
+      </w:r>
+      <w:r>
+        <w:rPr>
+          <w:rFonts w:ascii="Microsoft JhengHei" w:hAnsi="Microsoft JhengHei" w:eastAsia="Microsoft JhengHei" w:cs="Microsoft JhengHei"/>
+          <w:i w:val="0"/>
+          <w:sz w:val="22"/>
+        </w:rPr>
+        <w:t>、</w:t>
+      </w:r>
+      <w:r>
+        <w:rPr>
+          <w:rFonts w:ascii="Consolas" w:hAnsi="Consolas" w:eastAsia="Microsoft JhengHei" w:cs="Consolas"/>
+          <w:i w:val="0"/>
+          <w:sz w:val="20"/>
+        </w:rPr>
+        <w:t>/poc</w:t>
+      </w:r>
+      <w:r>
+        <w:rPr>
+          <w:rFonts w:ascii="Microsoft JhengHei" w:hAnsi="Microsoft JhengHei" w:eastAsia="Microsoft JhengHei" w:cs="Microsoft JhengHei"/>
+          <w:i w:val="0"/>
+          <w:sz w:val="22"/>
+        </w:rPr>
+        <w:t>。</w:t>
+      </w:r>
+    </w:p>
+    <w:p>
+      <w:pPr>
+        <w:pStyle w:val="Heading2"/>
+        <w:spacing w:before="200"/>
+      </w:pPr>
+      <w:r>
+        <w:rPr>
+          <w:b/>
+        </w:rPr>
+      </w:r>
+      <w:r>
+        <w:rPr>
+          <w:rFonts w:ascii="Microsoft JhengHei" w:hAnsi="Microsoft JhengHei" w:eastAsia="Microsoft JhengHei" w:cs="Microsoft JhengHei"/>
+          <w:b/>
+          <w:i w:val="0"/>
+          <w:color w:val="2C5F2D"/>
+          <w:sz w:val="26"/>
+        </w:rPr>
+        <w:t>Q5：跨領域合作、服務與技術的創新在哪裡？</w:t>
+      </w:r>
+    </w:p>
+    <w:p>
+      <w:r>
+        <w:rPr>
+          <w:rFonts w:ascii="Microsoft JhengHei" w:hAnsi="Microsoft JhengHei" w:eastAsia="Microsoft JhengHei" w:cs="Microsoft JhengHei"/>
+          <w:b/>
+          <w:i w:val="0"/>
+          <w:sz w:val="22"/>
+        </w:rPr>
+        <w:t>30 秒回答</w:t>
+      </w:r>
+    </w:p>
+    <w:p>
+      <w:pPr>
+        <w:pBdr>
+          <w:left w:val="single" w:sz="18" w:space="8" w:color="2C5F2D"/>
+        </w:pBdr>
+        <w:ind w:left="227"/>
+      </w:pPr>
+      <w:r>
+        <w:rPr>
+          <w:rFonts w:ascii="Microsoft JhengHei" w:hAnsi="Microsoft JhengHei" w:eastAsia="Microsoft JhengHei" w:cs="Microsoft JhengHei"/>
+          <w:i w:val="0"/>
+          <w:sz w:val="24"/>
+        </w:rPr>
+        <w:t>資料上，我們把水保署的崩塌目錄、照片與土石流資料，和內政部地形、國土測繪中心航照與光達、地調所地質、歐洲太空總署衛星、OpenStreetMap 社群資料，串到同一個坡面上。技術上，結合地形水文切坡面、衛星紅邊時間序列、電腦視覺對位，以及統計抽樣驗證。服務上，每個坡面一頁履歷，給巡查人員看，也給民眾查。</w:t>
+      </w:r>
+    </w:p>
+    <w:p>
+      <w:r>
+        <w:rPr>
+          <w:rFonts w:ascii="Microsoft JhengHei" w:hAnsi="Microsoft JhengHei" w:eastAsia="Microsoft JhengHei" w:cs="Microsoft JhengHei"/>
+          <w:b/>
+          <w:i w:val="0"/>
+          <w:sz w:val="22"/>
+        </w:rPr>
+        <w:t>被追問時的第二層</w:t>
+      </w:r>
+    </w:p>
+    <w:p>
+      <w:pPr>
+        <w:pStyle w:val="ListBullet"/>
+      </w:pPr>
+      <w:r>
+        <w:rPr>
+          <w:rFonts w:ascii="Microsoft JhengHei" w:hAnsi="Microsoft JhengHei" w:eastAsia="Microsoft JhengHei" w:cs="Microsoft JhengHei"/>
+          <w:b/>
+          <w:i w:val="0"/>
+          <w:sz w:val="22"/>
+        </w:rPr>
+        <w:t>為什麼算創新</w:t>
+      </w:r>
+      <w:r>
+        <w:rPr>
+          <w:rFonts w:ascii="Microsoft JhengHei" w:hAnsi="Microsoft JhengHei" w:eastAsia="Microsoft JhengHei" w:cs="Microsoft JhengHei"/>
+          <w:i w:val="0"/>
+          <w:sz w:val="22"/>
+        </w:rPr>
+        <w:t>：既有平台按圖層與事件分；我們按坡面串證據，並把每類證據的準確度與限制寫在同一頁。不給總分，所以要加新證據（雨量、地質）時直接加一類，不必重新訂權重。</w:t>
+      </w:r>
+    </w:p>
+    <w:p>
+      <w:pPr>
+        <w:pStyle w:val="ListBullet"/>
+      </w:pPr>
+      <w:r>
+        <w:rPr>
+          <w:rFonts w:ascii="Microsoft JhengHei" w:hAnsi="Microsoft JhengHei" w:eastAsia="Microsoft JhengHei" w:cs="Microsoft JhengHei"/>
+          <w:b/>
+          <w:i w:val="0"/>
+          <w:sz w:val="22"/>
+        </w:rPr>
+        <w:t>技術創新的實例</w:t>
+      </w:r>
+      <w:r>
+        <w:rPr>
+          <w:rFonts w:ascii="Microsoft JhengHei" w:hAnsi="Microsoft JhengHei" w:eastAsia="Microsoft JhengHei" w:cs="Microsoft JhengHei"/>
+          <w:i w:val="0"/>
+          <w:sz w:val="22"/>
+        </w:rPr>
+        <w:t>：</w:t>
+      </w:r>
+    </w:p>
+    <w:p>
+      <w:pPr>
+        <w:pStyle w:val="ListBullet2"/>
+      </w:pPr>
+      <w:r>
+        <w:rPr>
+          <w:rFonts w:ascii="Microsoft JhengHei" w:hAnsi="Microsoft JhengHei" w:eastAsia="Microsoft JhengHei" w:cs="Microsoft JhengHei"/>
+          <w:i w:val="0"/>
+          <w:sz w:val="22"/>
+        </w:rPr>
+        <w:t>坡面單元採集水區重疊法（依陳組長建議），ID 帶版本。</w:t>
+      </w:r>
+    </w:p>
+    <w:p>
+      <w:pPr>
+        <w:pStyle w:val="ListBullet2"/>
+      </w:pPr>
+      <w:r>
+        <w:rPr>
+          <w:rFonts w:ascii="Microsoft JhengHei" w:hAnsi="Microsoft JhengHei" w:eastAsia="Microsoft JhengHei" w:cs="Microsoft JhengHei"/>
+          <w:i w:val="0"/>
+          <w:sz w:val="22"/>
+        </w:rPr>
+        <w:t>沒有 GPS 的 UAV 照片用 20 m 地形合成斜視圖再以 LoFTR 匹配解算相機姿態。</w:t>
+      </w:r>
+    </w:p>
+    <w:p>
+      <w:pPr>
+        <w:pStyle w:val="ListBullet2"/>
+      </w:pPr>
+      <w:r>
+        <w:rPr>
+          <w:rFonts w:ascii="Microsoft JhengHei" w:hAnsi="Microsoft JhengHei" w:eastAsia="Microsoft JhengHei" w:cs="Microsoft JhengHei"/>
+          <w:i w:val="0"/>
+          <w:sz w:val="22"/>
+        </w:rPr>
+        <w:t>驗證採分層抽樣、附 95% 信賴區間。</w:t>
+      </w:r>
+    </w:p>
+    <w:p>
+      <w:pPr>
+        <w:pStyle w:val="ListBullet"/>
+      </w:pPr>
+      <w:r>
+        <w:rPr>
+          <w:rFonts w:ascii="Microsoft JhengHei" w:hAnsi="Microsoft JhengHei" w:eastAsia="Microsoft JhengHei" w:cs="Microsoft JhengHei"/>
+          <w:b/>
+          <w:i w:val="0"/>
+          <w:sz w:val="22"/>
+        </w:rPr>
+        <w:t>合作</w:t>
+      </w:r>
+      <w:r>
+        <w:rPr>
+          <w:rFonts w:ascii="Microsoft JhengHei" w:hAnsi="Microsoft JhengHei" w:eastAsia="Microsoft JhengHei" w:cs="Microsoft JhengHei"/>
+          <w:i w:val="0"/>
+          <w:sz w:val="22"/>
+        </w:rPr>
+        <w:t>：輔導委員陳組長、臧老師的建議都已落實（坡面單元、有效坡面、停止 3D／UAV 主線、分層人工驗證）；專家盲判與實務人員測試已請陳組長協助轉寄。</w:t>
+      </w:r>
+    </w:p>
+    <w:p>
+      <w:pPr>
+        <w:pStyle w:val="ListBullet"/>
+      </w:pPr>
+      <w:r>
+        <w:rPr>
+          <w:rFonts w:ascii="Microsoft JhengHei" w:hAnsi="Microsoft JhengHei" w:eastAsia="Microsoft JhengHei" w:cs="Microsoft JhengHei"/>
+          <w:b/>
+          <w:i w:val="0"/>
+          <w:sz w:val="22"/>
+        </w:rPr>
+        <w:t>可翻</w:t>
+      </w:r>
+      <w:r>
+        <w:rPr>
+          <w:rFonts w:ascii="Microsoft JhengHei" w:hAnsi="Microsoft JhengHei" w:eastAsia="Microsoft JhengHei" w:cs="Microsoft JhengHei"/>
+          <w:i w:val="0"/>
+          <w:sz w:val="22"/>
+        </w:rPr>
+        <w:t>：第 3、4 頁；備用第 9 頁。</w:t>
+      </w:r>
+    </w:p>
+    <w:p>
+      <w:pPr>
+        <w:pStyle w:val="Heading2"/>
+        <w:spacing w:before="200"/>
+      </w:pPr>
+      <w:r>
+        <w:rPr>
+          <w:b/>
+        </w:rPr>
+      </w:r>
+      <w:r>
+        <w:rPr>
+          <w:rFonts w:ascii="Microsoft JhengHei" w:hAnsi="Microsoft JhengHei" w:eastAsia="Microsoft JhengHei" w:cs="Microsoft JhengHei"/>
+          <w:b/>
+          <w:i w:val="0"/>
+          <w:color w:val="2C5F2D"/>
+          <w:sz w:val="26"/>
+        </w:rPr>
+        <w:t>Q6：實機展示驗證的狀況？</w:t>
+      </w:r>
+    </w:p>
+    <w:p>
+      <w:r>
+        <w:rPr>
+          <w:rFonts w:ascii="Microsoft JhengHei" w:hAnsi="Microsoft JhengHei" w:eastAsia="Microsoft JhengHei" w:cs="Microsoft JhengHei"/>
+          <w:b/>
+          <w:i w:val="0"/>
+          <w:sz w:val="22"/>
+        </w:rPr>
+        <w:t>30 秒回答</w:t>
+      </w:r>
+    </w:p>
+    <w:p>
+      <w:pPr>
+        <w:pBdr>
+          <w:left w:val="single" w:sz="18" w:space="8" w:color="2C5F2D"/>
+        </w:pBdr>
+        <w:ind w:left="227"/>
+      </w:pPr>
+      <w:r>
+        <w:rPr>
+          <w:rFonts w:ascii="Microsoft JhengHei" w:hAnsi="Microsoft JhengHei" w:eastAsia="Microsoft JhengHei" w:cs="Microsoft JhengHei"/>
+          <w:i w:val="0"/>
+          <w:sz w:val="24"/>
+        </w:rPr>
+        <w:t>系統已經在線上公開運作，評審現在就可以打開網址操作。功能面，我們在 10 月 28 日部署後逐頁檢查過；效果面，每個自動訊號都和官方目錄或人工判讀比對過、附信賴區間。唯一還在進行的是專家盲判和實務人員測試，結果回收後會用來調整規則。</w:t>
+      </w:r>
+    </w:p>
+    <w:p>
+      <w:r>
+        <w:rPr>
+          <w:rFonts w:ascii="Microsoft JhengHei" w:hAnsi="Microsoft JhengHei" w:eastAsia="Microsoft JhengHei" w:cs="Microsoft JhengHei"/>
+          <w:b/>
+          <w:i w:val="0"/>
+          <w:sz w:val="22"/>
+        </w:rPr>
+        <w:t>被追問時的第二層</w:t>
+      </w:r>
+    </w:p>
+    <w:p>
+      <w:pPr>
+        <w:pStyle w:val="ListBullet"/>
+      </w:pPr>
+      <w:r>
+        <w:rPr>
+          <w:rFonts w:ascii="Microsoft JhengHei" w:hAnsi="Microsoft JhengHei" w:eastAsia="Microsoft JhengHei" w:cs="Microsoft JhengHei"/>
+          <w:b/>
+          <w:i w:val="0"/>
+          <w:sz w:val="22"/>
+        </w:rPr>
+        <w:t>功能驗證</w:t>
+      </w:r>
+      <w:r>
+        <w:rPr>
+          <w:rFonts w:ascii="Microsoft JhengHei" w:hAnsi="Microsoft JhengHei" w:eastAsia="Microsoft JhengHei" w:cs="Microsoft JhengHei"/>
+          <w:i w:val="0"/>
+          <w:sz w:val="22"/>
+        </w:rPr>
+        <w:t>：</w:t>
+      </w:r>
+    </w:p>
+    <w:p>
+      <w:pPr>
+        <w:pStyle w:val="ListBullet2"/>
+      </w:pPr>
+      <w:r>
+        <w:rPr>
+          <w:rFonts w:ascii="Microsoft JhengHei" w:hAnsi="Microsoft JhengHei" w:eastAsia="Microsoft JhengHei" w:cs="Microsoft JhengHei"/>
+          <w:i w:val="0"/>
+          <w:sz w:val="22"/>
+        </w:rPr>
+        <w:t>首頁、</w:t>
+      </w:r>
+      <w:r>
+        <w:rPr>
+          <w:rFonts w:ascii="Consolas" w:hAnsi="Consolas" w:eastAsia="Microsoft JhengHei" w:cs="Consolas"/>
+          <w:i w:val="0"/>
+          <w:sz w:val="20"/>
+        </w:rPr>
+        <w:t>/su</w:t>
+      </w:r>
+      <w:r>
+        <w:rPr>
+          <w:rFonts w:ascii="Microsoft JhengHei" w:hAnsi="Microsoft JhengHei" w:eastAsia="Microsoft JhengHei" w:cs="Microsoft JhengHei"/>
+          <w:i w:val="0"/>
+          <w:sz w:val="22"/>
+        </w:rPr>
+        <w:t>、</w:t>
+      </w:r>
+      <w:r>
+        <w:rPr>
+          <w:rFonts w:ascii="Consolas" w:hAnsi="Consolas" w:eastAsia="Microsoft JhengHei" w:cs="Consolas"/>
+          <w:i w:val="0"/>
+          <w:sz w:val="20"/>
+        </w:rPr>
+        <w:t>/poc</w:t>
+      </w:r>
+      <w:r>
+        <w:rPr>
+          <w:rFonts w:ascii="Microsoft JhengHei" w:hAnsi="Microsoft JhengHei" w:eastAsia="Microsoft JhengHei" w:cs="Microsoft JhengHei"/>
+          <w:i w:val="0"/>
+          <w:sz w:val="22"/>
+        </w:rPr>
+        <w:t>、</w:t>
+      </w:r>
+      <w:r>
+        <w:rPr>
+          <w:rFonts w:ascii="Consolas" w:hAnsi="Consolas" w:eastAsia="Microsoft JhengHei" w:cs="Consolas"/>
+          <w:i w:val="0"/>
+          <w:sz w:val="20"/>
+        </w:rPr>
+        <w:t>/roadmap</w:t>
+      </w:r>
+      <w:r>
+        <w:rPr>
+          <w:rFonts w:ascii="Microsoft JhengHei" w:hAnsi="Microsoft JhengHei" w:eastAsia="Microsoft JhengHei" w:cs="Microsoft JhengHei"/>
+          <w:i w:val="0"/>
+          <w:sz w:val="22"/>
+        </w:rPr>
+        <w:t>、</w:t>
+      </w:r>
+      <w:r>
+        <w:rPr>
+          <w:rFonts w:ascii="Consolas" w:hAnsi="Consolas" w:eastAsia="Microsoft JhengHei" w:cs="Consolas"/>
+          <w:i w:val="0"/>
+          <w:sz w:val="20"/>
+        </w:rPr>
+        <w:t>/system</w:t>
+      </w:r>
+      <w:r>
+        <w:rPr>
+          <w:rFonts w:ascii="Microsoft JhengHei" w:hAnsi="Microsoft JhengHei" w:eastAsia="Microsoft JhengHei" w:cs="Microsoft JhengHei"/>
+          <w:i w:val="0"/>
+          <w:sz w:val="22"/>
+        </w:rPr>
+        <w:t>、UAV 3D 頁全部正常回應。</w:t>
+      </w:r>
+    </w:p>
+    <w:p>
+      <w:pPr>
+        <w:pStyle w:val="ListBullet2"/>
+      </w:pPr>
+      <w:r>
+        <w:rPr>
+          <w:rFonts w:ascii="Consolas" w:hAnsi="Consolas" w:eastAsia="Microsoft JhengHei" w:cs="Consolas"/>
+          <w:i w:val="0"/>
+          <w:sz w:val="20"/>
+        </w:rPr>
+        <w:t>/su</w:t>
+      </w:r>
+      <w:r>
+        <w:rPr>
+          <w:rFonts w:ascii="Microsoft JhengHei" w:hAnsi="Microsoft JhengHei" w:eastAsia="Microsoft JhengHei" w:cs="Microsoft JhengHei"/>
+          <w:i w:val="0"/>
+          <w:sz w:val="22"/>
+        </w:rPr>
+        <w:t xml:space="preserve"> 的 3D 地形、逐年航照、地調所疊圖、點選坡面都實測過。</w:t>
+      </w:r>
+    </w:p>
+    <w:p>
+      <w:pPr>
+        <w:pStyle w:val="ListBullet2"/>
+      </w:pPr>
+      <w:r>
+        <w:rPr>
+          <w:rFonts w:ascii="Microsoft JhengHei" w:hAnsi="Microsoft JhengHei" w:eastAsia="Microsoft JhengHei" w:cs="Microsoft JhengHei"/>
+          <w:i w:val="0"/>
+          <w:sz w:val="22"/>
+        </w:rPr>
+        <w:t>坡面資料壓縮後 1.2 MB，一般網路幾秒內載入。</w:t>
+      </w:r>
+    </w:p>
+    <w:p>
+      <w:pPr>
+        <w:pStyle w:val="ListBullet"/>
+      </w:pPr>
+      <w:r>
+        <w:rPr>
+          <w:rFonts w:ascii="Microsoft JhengHei" w:hAnsi="Microsoft JhengHei" w:eastAsia="Microsoft JhengHei" w:cs="Microsoft JhengHei"/>
+          <w:b/>
+          <w:i w:val="0"/>
+          <w:sz w:val="22"/>
+        </w:rPr>
+        <w:t>效果驗證</w:t>
+      </w:r>
+      <w:r>
+        <w:rPr>
+          <w:rFonts w:ascii="Microsoft JhengHei" w:hAnsi="Microsoft JhengHei" w:eastAsia="Microsoft JhengHei" w:cs="Microsoft JhengHei"/>
+          <w:i w:val="0"/>
+          <w:sz w:val="22"/>
+        </w:rPr>
+        <w:t>：大事件後偵測率 75%・43%、誤報約 2%；平時約 25%；人工與官方一致 69%；UAV 每組留出 30% 匹配點檢核，50 組誤差中位數 2.2 m。</w:t>
+      </w:r>
+    </w:p>
+    <w:p>
+      <w:pPr>
+        <w:pStyle w:val="ListBullet"/>
+      </w:pPr>
+      <w:r>
+        <w:rPr>
+          <w:rFonts w:ascii="Microsoft JhengHei" w:hAnsi="Microsoft JhengHei" w:eastAsia="Microsoft JhengHei" w:cs="Microsoft JhengHei"/>
+          <w:b/>
+          <w:i w:val="0"/>
+          <w:sz w:val="22"/>
+        </w:rPr>
+        <w:t>尚未完成</w:t>
+      </w:r>
+      <w:r>
+        <w:rPr>
+          <w:rFonts w:ascii="Microsoft JhengHei" w:hAnsi="Microsoft JhengHei" w:eastAsia="Microsoft JhengHei" w:cs="Microsoft JhengHei"/>
+          <w:i w:val="0"/>
+          <w:sz w:val="22"/>
+        </w:rPr>
+        <w:t>：專家盲判、實務人員操作測試（決賽前若回收，改講實際數字）。</w:t>
+      </w:r>
+    </w:p>
+    <w:p>
+      <w:pPr>
+        <w:pStyle w:val="ListBullet"/>
+      </w:pPr>
+      <w:r>
+        <w:rPr>
+          <w:rFonts w:ascii="Microsoft JhengHei" w:hAnsi="Microsoft JhengHei" w:eastAsia="Microsoft JhengHei" w:cs="Microsoft JhengHei"/>
+          <w:b/>
+          <w:i w:val="0"/>
+          <w:sz w:val="22"/>
+        </w:rPr>
+        <w:t>可翻</w:t>
+      </w:r>
+      <w:r>
+        <w:rPr>
+          <w:rFonts w:ascii="Microsoft JhengHei" w:hAnsi="Microsoft JhengHei" w:eastAsia="Microsoft JhengHei" w:cs="Microsoft JhengHei"/>
+          <w:i w:val="0"/>
+          <w:sz w:val="22"/>
+        </w:rPr>
+        <w:t xml:space="preserve">：備用第 8 頁；網站 </w:t>
+      </w:r>
+      <w:r>
+        <w:rPr>
+          <w:rFonts w:ascii="Consolas" w:hAnsi="Consolas" w:eastAsia="Microsoft JhengHei" w:cs="Consolas"/>
+          <w:i w:val="0"/>
+          <w:sz w:val="20"/>
+        </w:rPr>
+        <w:t>/poc</w:t>
+      </w:r>
+      <w:r>
+        <w:rPr>
+          <w:rFonts w:ascii="Microsoft JhengHei" w:hAnsi="Microsoft JhengHei" w:eastAsia="Microsoft JhengHei" w:cs="Microsoft JhengHei"/>
+          <w:i w:val="0"/>
+          <w:sz w:val="22"/>
+        </w:rPr>
+        <w:t>。</w:t>
+      </w:r>
+    </w:p>
+    <w:p>
+      <w:pPr>
+        <w:pBdr>
+          <w:bottom w:val="single" w:sz="6" w:space="1" w:color="C8D3CA"/>
+        </w:pBdr>
+      </w:pPr>
+    </w:p>
+    <w:p>
+      <w:pPr>
+        <w:pStyle w:val="Heading1"/>
+        <w:spacing w:before="280"/>
+      </w:pPr>
+      <w:r>
+        <w:rPr>
+          <w:b/>
+        </w:rPr>
+      </w:r>
+      <w:r>
+        <w:rPr>
+          <w:rFonts w:ascii="Microsoft JhengHei" w:hAnsi="Microsoft JhengHei" w:eastAsia="Microsoft JhengHei" w:cs="Microsoft JhengHei"/>
+          <w:b/>
+          <w:i w:val="0"/>
+          <w:color w:val="2C5F2D"/>
+          <w:sz w:val="30"/>
+        </w:rPr>
+        <w:t>三、其他可能的提問</w:t>
       </w:r>
     </w:p>
     <w:p>
@@ -944,7 +1611,7 @@
           <w:color w:val="2C5F2D"/>
           <w:sz w:val="30"/>
         </w:rPr>
-        <w:t>三、速查數字</w:t>
+        <w:t>四、速查數字</w:t>
       </w:r>
     </w:p>
     <w:tbl>
@@ -1326,6 +1993,40 @@
                 <w:i w:val="0"/>
                 <w:sz w:val="20"/>
               </w:rPr>
+              <w:t>大事件後先看的坡面比例</w:t>
+            </w:r>
+          </w:p>
+        </w:tc>
+        <w:tc>
+          <w:tcPr>
+            <w:tcW w:type="dxa" w:w="7239"/>
+          </w:tcPr>
+          <w:p>
+            <w:r/>
+            <w:r>
+              <w:rPr>
+                <w:rFonts w:ascii="Microsoft JhengHei" w:hAnsi="Microsoft JhengHei" w:eastAsia="Microsoft JhengHei" w:cs="Microsoft JhengHei"/>
+                <w:i w:val="0"/>
+                <w:sz w:val="20"/>
+              </w:rPr>
+              <w:t>花蓮 3.0%（196/6,547）涵蓋 75% 崩塌坡面；太魯閣 5.3%（254/4,749）涵蓋 43%；高雄優先 3.2%（411/12,730）</w:t>
+            </w:r>
+          </w:p>
+        </w:tc>
+      </w:tr>
+      <w:tr>
+        <w:tc>
+          <w:tcPr>
+            <w:tcW w:type="dxa" w:w="2172"/>
+          </w:tcPr>
+          <w:p>
+            <w:r/>
+            <w:r>
+              <w:rPr>
+                <w:rFonts w:ascii="Microsoft JhengHei" w:hAnsi="Microsoft JhengHei" w:eastAsia="Microsoft JhengHei" w:cs="Microsoft JhengHei"/>
+                <w:i w:val="0"/>
+                <w:sz w:val="20"/>
+              </w:rPr>
               <w:t>UAV 自動對位</w:t>
             </w:r>
           </w:p>

</xml_diff>

<commit_message>
Deck slide 6 and Q&A: report-section data-governance example and report automation
Co-Authored-By: Claude Opus 5.5 <noreply@anthropic.com>
</commit_message>
<xml_diff>
--- a/presentation/評審問答演練.docx
+++ b/presentation/評審問答演練.docx
@@ -1552,6 +1552,64 @@
           <w:i w:val="0"/>
           <w:sz w:val="22"/>
         </w:rPr>
+        <w:t>Q：你們建議的「資料治理小改變」具體是什麼？有實例嗎？</w:t>
+      </w:r>
+    </w:p>
+    <w:p>
+      <w:r>
+        <w:rPr>
+          <w:rFonts w:ascii="Microsoft JhengHei" w:hAnsi="Microsoft JhengHei" w:eastAsia="Microsoft JhengHei" w:cs="Microsoft JhengHei"/>
+          <w:i w:val="0"/>
+          <w:sz w:val="22"/>
+        </w:rPr>
+        <w:t xml:space="preserve">有。水保署 10 月 28 日新上線的崩塌報告專區已附影像日期與各鄉鎮完成判釋率，方向正確，但只有 PDF。我們從 13 份報告解析出 1,567 處新生崩塌，要接回 75 列跨頁切開的表格、修正 10 筆錯字，還發現 1 處統計表與列表對不上。若同時附 CSV 或 GeoJSON 點位檔，任何系統都能直接接。我們也示範反方向：系統可從點位自動產出報告 PDF 與 CSV（網站 </w:t>
+      </w:r>
+      <w:r>
+        <w:rPr>
+          <w:rFonts w:ascii="Consolas" w:hAnsi="Consolas" w:eastAsia="Microsoft JhengHei" w:cs="Consolas"/>
+          <w:i w:val="0"/>
+          <w:sz w:val="20"/>
+        </w:rPr>
+        <w:t>/reports</w:t>
+      </w:r>
+      <w:r>
+        <w:rPr>
+          <w:rFonts w:ascii="Microsoft JhengHei" w:hAnsi="Microsoft JhengHei" w:eastAsia="Microsoft JhengHei" w:cs="Microsoft JhengHei"/>
+          <w:i w:val="0"/>
+          <w:sz w:val="22"/>
+        </w:rPr>
+        <w:t>），統計表八成以上可自動化，只有圈繪崩塌必須由人做。</w:t>
+      </w:r>
+    </w:p>
+    <w:p>
+      <w:r>
+        <w:rPr>
+          <w:rFonts w:ascii="Microsoft JhengHei" w:hAnsi="Microsoft JhengHei" w:eastAsia="Microsoft JhengHei" w:cs="Microsoft JhengHei"/>
+          <w:b/>
+          <w:i w:val="0"/>
+          <w:sz w:val="22"/>
+        </w:rPr>
+        <w:t>Q：可以自動產製崩塌判釋報告嗎？</w:t>
+      </w:r>
+    </w:p>
+    <w:p>
+      <w:r>
+        <w:rPr>
+          <w:rFonts w:ascii="Microsoft JhengHei" w:hAnsi="Microsoft JhengHei" w:eastAsia="Microsoft JhengHei" w:cs="Microsoft JhengHei"/>
+          <w:i w:val="0"/>
+          <w:sz w:val="22"/>
+        </w:rPr>
+        <w:t>統計、地圖、列表可以（用解析出的列表重算鄉鎮面積，129 列有 127 列與官方統計表一致）；圈繪新生崩塌不行。我們用 2025–2026 官方點位檢驗：坡面紅邊下降只在崩塌占坡面 ≥20% 時抓到 35%，全部只有 3%，因為官方圈的崩塌中位數只有 0.3 ha。所以自動化放在「人工圈繪之後」：幾分鐘內產出報告、點位檔與坡面履歷；圈繪之前則提供候選坡面與各鄉鎮雲覆蓋，幫判釋人員排順序。</w:t>
+      </w:r>
+    </w:p>
+    <w:p>
+      <w:r>
+        <w:rPr>
+          <w:rFonts w:ascii="Microsoft JhengHei" w:hAnsi="Microsoft JhengHei" w:eastAsia="Microsoft JhengHei" w:cs="Microsoft JhengHei"/>
+          <w:b/>
+          <w:i w:val="0"/>
+          <w:sz w:val="22"/>
+        </w:rPr>
         <w:t>Q：資料授權與使用條款？</w:t>
       </w:r>
     </w:p>

</xml_diff>